<commit_message>
fix job description bookmark template
</commit_message>
<xml_diff>
--- a/Case Code Activity Classes/HR/Job Description/Job_Description_Template.docx
+++ b/Case Code Activity Classes/HR/Job Description/Job_Description_Template.docx
@@ -18,23 +18,24 @@
     <w:tbl>
       <w:tblPr>
         <w:tblStyle w:val="TableGrid"/>
-        <w:tblW w:w="0" w:type="auto"/>
+        <w:tblW w:w="10796" w:type="dxa"/>
         <w:jc w:val="center"/>
         <w:tblLook w:val="04A0" w:firstRow="1" w:lastRow="0" w:firstColumn="1" w:lastColumn="0" w:noHBand="0" w:noVBand="1"/>
       </w:tblPr>
       <w:tblGrid>
-        <w:gridCol w:w="2052"/>
-        <w:gridCol w:w="3042"/>
-        <w:gridCol w:w="2157"/>
-        <w:gridCol w:w="3333"/>
+        <w:gridCol w:w="2093"/>
+        <w:gridCol w:w="3103"/>
+        <w:gridCol w:w="2200"/>
+        <w:gridCol w:w="3400"/>
       </w:tblGrid>
       <w:tr>
         <w:trPr>
+          <w:trHeight w:val="401"/>
           <w:jc w:val="center"/>
         </w:trPr>
         <w:tc>
           <w:tcPr>
-            <w:tcW w:w="2052" w:type="dxa"/>
+            <w:tcW w:w="2093" w:type="dxa"/>
             <w:shd w:val="clear" w:color="auto" w:fill="F2F2F2"/>
             <w:vAlign w:val="center"/>
           </w:tcPr>
@@ -49,7 +50,7 @@
         </w:tc>
         <w:tc>
           <w:tcPr>
-            <w:tcW w:w="3042" w:type="dxa"/>
+            <w:tcW w:w="3103" w:type="dxa"/>
             <w:shd w:val="clear" w:color="auto" w:fill="F2F2F2"/>
           </w:tcPr>
           <w:p>
@@ -79,7 +80,7 @@
         </w:tc>
         <w:tc>
           <w:tcPr>
-            <w:tcW w:w="2157" w:type="dxa"/>
+            <w:tcW w:w="2200" w:type="dxa"/>
             <w:shd w:val="clear" w:color="auto" w:fill="F2F2F2"/>
             <w:vAlign w:val="center"/>
           </w:tcPr>
@@ -94,7 +95,7 @@
         </w:tc>
         <w:tc>
           <w:tcPr>
-            <w:tcW w:w="3333" w:type="dxa"/>
+            <w:tcW w:w="3400" w:type="dxa"/>
             <w:shd w:val="clear" w:color="auto" w:fill="F2F2F2"/>
           </w:tcPr>
           <w:p>
@@ -125,14 +126,113 @@
       </w:tr>
       <w:tr>
         <w:trPr>
+          <w:trHeight w:val="401"/>
           <w:jc w:val="center"/>
         </w:trPr>
         <w:tc>
           <w:tcPr>
-            <w:tcW w:w="2052" w:type="dxa"/>
+            <w:tcW w:w="2093" w:type="dxa"/>
             <w:vAlign w:val="center"/>
           </w:tcPr>
           <w:p>
+            <w:r>
+              <w:rPr>
+                <w:b/>
+              </w:rPr>
+              <w:t>Report</w:t>
+            </w:r>
+            <w:r>
+              <w:rPr>
+                <w:b/>
+              </w:rPr>
+              <w:t xml:space="preserve"> to CEO:</w:t>
+            </w:r>
+          </w:p>
+        </w:tc>
+        <w:tc>
+          <w:tcPr>
+            <w:tcW w:w="3103" w:type="dxa"/>
+          </w:tcPr>
+          <w:p>
+            <w:bookmarkStart w:id="2" w:name="isDirectReporteeToCEO"/>
+            <w:r>
+              <w:rPr>
+                <w:color w:val="1F4E79"/>
+              </w:rPr>
+              <w:t>«</w:t>
+            </w:r>
+            <w:proofErr w:type="spellStart"/>
+            <w:r>
+              <w:rPr>
+                <w:color w:val="1F4E79"/>
+              </w:rPr>
+              <w:t>isDirectReporteeToCEO</w:t>
+            </w:r>
+            <w:proofErr w:type="spellEnd"/>
+            <w:r>
+              <w:rPr>
+                <w:color w:val="1F4E79"/>
+              </w:rPr>
+              <w:t>»</w:t>
+            </w:r>
+            <w:bookmarkEnd w:id="2"/>
+          </w:p>
+        </w:tc>
+        <w:tc>
+          <w:tcPr>
+            <w:tcW w:w="2200" w:type="dxa"/>
+            <w:vAlign w:val="center"/>
+          </w:tcPr>
+          <w:p>
+            <w:r>
+              <w:rPr>
+                <w:b/>
+              </w:rPr>
+              <w:t>Department:</w:t>
+            </w:r>
+          </w:p>
+        </w:tc>
+        <w:tc>
+          <w:tcPr>
+            <w:tcW w:w="3400" w:type="dxa"/>
+          </w:tcPr>
+          <w:p>
+            <w:bookmarkStart w:id="3" w:name="departmentText"/>
+            <w:r>
+              <w:rPr>
+                <w:color w:val="1F4E79"/>
+              </w:rPr>
+              <w:t>«department»</w:t>
+            </w:r>
+            <w:bookmarkEnd w:id="3"/>
+          </w:p>
+        </w:tc>
+      </w:tr>
+      <w:tr>
+        <w:trPr>
+          <w:trHeight w:val="401"/>
+          <w:jc w:val="center"/>
+        </w:trPr>
+        <w:tc>
+          <w:tcPr>
+            <w:tcW w:w="2093" w:type="dxa"/>
+            <w:vAlign w:val="center"/>
+          </w:tcPr>
+          <w:p>
+            <w:r>
+              <w:rPr>
+                <w:b/>
+                <w:bCs/>
+              </w:rPr>
+              <w:t>Job</w:t>
+            </w:r>
+            <w:r>
+              <w:rPr>
+                <w:b/>
+                <w:bCs/>
+              </w:rPr>
+              <w:t xml:space="preserve"> </w:t>
+            </w:r>
             <w:r>
               <w:rPr>
                 <w:b/>
@@ -143,10 +243,10 @@
         </w:tc>
         <w:tc>
           <w:tcPr>
-            <w:tcW w:w="3042" w:type="dxa"/>
+            <w:tcW w:w="3103" w:type="dxa"/>
           </w:tcPr>
           <w:p>
-            <w:bookmarkStart w:id="2" w:name="jobTitle"/>
+            <w:bookmarkStart w:id="4" w:name="jobTitleText"/>
             <w:r>
               <w:rPr>
                 <w:color w:val="1F4E79"/>
@@ -167,95 +267,12 @@
               </w:rPr>
               <w:t>»</w:t>
             </w:r>
-            <w:bookmarkEnd w:id="2"/>
-          </w:p>
-        </w:tc>
-        <w:tc>
-          <w:tcPr>
-            <w:tcW w:w="2157" w:type="dxa"/>
-            <w:vAlign w:val="center"/>
-          </w:tcPr>
-          <w:p>
-            <w:r>
-              <w:rPr>
-                <w:b/>
-              </w:rPr>
-              <w:t>Job Code:</w:t>
-            </w:r>
-          </w:p>
-        </w:tc>
-        <w:tc>
-          <w:tcPr>
-            <w:tcW w:w="3333" w:type="dxa"/>
-          </w:tcPr>
-          <w:p>
-            <w:bookmarkStart w:id="3" w:name="jobCode"/>
-            <w:r>
-              <w:rPr>
-                <w:color w:val="1F4E79"/>
-              </w:rPr>
-              <w:t>«</w:t>
-            </w:r>
-            <w:proofErr w:type="spellStart"/>
-            <w:r>
-              <w:rPr>
-                <w:color w:val="1F4E79"/>
-              </w:rPr>
-              <w:t>jobCode</w:t>
-            </w:r>
-            <w:proofErr w:type="spellEnd"/>
-            <w:r>
-              <w:rPr>
-                <w:color w:val="1F4E79"/>
-              </w:rPr>
-              <w:t>»</w:t>
-            </w:r>
-            <w:bookmarkEnd w:id="3"/>
-          </w:p>
-        </w:tc>
-      </w:tr>
-      <w:tr>
-        <w:trPr>
-          <w:jc w:val="center"/>
-        </w:trPr>
-        <w:tc>
-          <w:tcPr>
-            <w:tcW w:w="2052" w:type="dxa"/>
-            <w:vAlign w:val="center"/>
-          </w:tcPr>
-          <w:p>
-            <w:r>
-              <w:rPr>
-                <w:b/>
-              </w:rPr>
-              <w:t>De</w:t>
-            </w:r>
-            <w:r>
-              <w:rPr>
-                <w:b/>
-              </w:rPr>
-              <w:t>partment:</w:t>
-            </w:r>
-          </w:p>
-        </w:tc>
-        <w:tc>
-          <w:tcPr>
-            <w:tcW w:w="3042" w:type="dxa"/>
-          </w:tcPr>
-          <w:p>
-            <w:bookmarkStart w:id="4" w:name="department"/>
-            <w:r>
-              <w:rPr>
-                <w:color w:val="1F4E79"/>
-              </w:rPr>
-              <w:t>«department»</w:t>
-            </w:r>
             <w:bookmarkEnd w:id="4"/>
           </w:p>
         </w:tc>
         <w:tc>
           <w:tcPr>
-            <w:tcW w:w="2157" w:type="dxa"/>
+            <w:tcW w:w="2200" w:type="dxa"/>
             <w:vAlign w:val="center"/>
           </w:tcPr>
           <w:p>
@@ -269,10 +286,10 @@
         </w:tc>
         <w:tc>
           <w:tcPr>
-            <w:tcW w:w="3333" w:type="dxa"/>
+            <w:tcW w:w="3400" w:type="dxa"/>
           </w:tcPr>
           <w:p>
-            <w:bookmarkStart w:id="5" w:name="reportingTo"/>
+            <w:bookmarkStart w:id="5" w:name="reportingToText"/>
             <w:r>
               <w:rPr>
                 <w:color w:val="1F4E79"/>
@@ -299,11 +316,12 @@
       </w:tr>
       <w:tr>
         <w:trPr>
+          <w:trHeight w:val="401"/>
           <w:jc w:val="center"/>
         </w:trPr>
         <w:tc>
           <w:tcPr>
-            <w:tcW w:w="2052" w:type="dxa"/>
+            <w:tcW w:w="2093" w:type="dxa"/>
             <w:vAlign w:val="center"/>
           </w:tcPr>
           <w:p>
@@ -317,7 +335,7 @@
         </w:tc>
         <w:tc>
           <w:tcPr>
-            <w:tcW w:w="3042" w:type="dxa"/>
+            <w:tcW w:w="3103" w:type="dxa"/>
           </w:tcPr>
           <w:p>
             <w:bookmarkStart w:id="6" w:name="gradeLevel"/>
@@ -346,7 +364,7 @@
         </w:tc>
         <w:tc>
           <w:tcPr>
-            <w:tcW w:w="2157" w:type="dxa"/>
+            <w:tcW w:w="2200" w:type="dxa"/>
             <w:vAlign w:val="center"/>
           </w:tcPr>
           <w:p>
@@ -354,30 +372,16 @@
               <w:rPr>
                 <w:b/>
               </w:rPr>
-              <w:t xml:space="preserve">Direct </w:t>
-            </w:r>
-            <w:proofErr w:type="spellStart"/>
-            <w:r>
-              <w:rPr>
-                <w:b/>
-              </w:rPr>
-              <w:t>Reportee</w:t>
-            </w:r>
-            <w:proofErr w:type="spellEnd"/>
-            <w:r>
-              <w:rPr>
-                <w:b/>
-              </w:rPr>
-              <w:t xml:space="preserve"> to CEO:</w:t>
+              <w:t>Job Code:</w:t>
             </w:r>
           </w:p>
         </w:tc>
         <w:tc>
           <w:tcPr>
-            <w:tcW w:w="3333" w:type="dxa"/>
+            <w:tcW w:w="3400" w:type="dxa"/>
           </w:tcPr>
           <w:p>
-            <w:bookmarkStart w:id="7" w:name="isDirectReporteeToCEO"/>
+            <w:bookmarkStart w:id="7" w:name="jobCode"/>
             <w:r>
               <w:rPr>
                 <w:color w:val="1F4E79"/>
@@ -389,7 +393,7 @@
               <w:rPr>
                 <w:color w:val="1F4E79"/>
               </w:rPr>
-              <w:t>isDirectReporteeToCEO</w:t>
+              <w:t>jobCode</w:t>
             </w:r>
             <w:proofErr w:type="spellEnd"/>
             <w:r>
@@ -403,6 +407,16 @@
         </w:tc>
       </w:tr>
     </w:tbl>
+    <w:p>
+      <w:pPr>
+        <w:spacing w:before="200" w:after="80"/>
+        <w:rPr>
+          <w:b/>
+          <w:color w:val="006666"/>
+          <w:sz w:val="22"/>
+        </w:rPr>
+      </w:pPr>
+    </w:p>
     <w:p>
       <w:pPr>
         <w:spacing w:before="200" w:after="80"/>
@@ -491,33 +505,58 @@
           </w:tcPr>
           <w:p>
             <w:pPr>
-              <w:spacing w:before="200" w:after="80"/>
               <w:rPr>
                 <w:color w:val="1F4E79"/>
               </w:rPr>
             </w:pPr>
-            <w:bookmarkStart w:id="9" w:name="responsibilitiesFormatted"/>
+          </w:p>
+          <w:p>
+            <w:pPr>
+              <w:rPr>
+                <w:color w:val="1F4E79"/>
+              </w:rPr>
+            </w:pPr>
+            <w:bookmarkStart w:id="9" w:name="responsibilities"/>
             <w:r>
               <w:rPr>
                 <w:color w:val="1F4E79"/>
               </w:rPr>
               <w:t>«</w:t>
             </w:r>
-            <w:proofErr w:type="spellStart"/>
             <w:r>
               <w:rPr>
                 <w:color w:val="1F4E79"/>
               </w:rPr>
-              <w:t>responsibilitiesFormatted</w:t>
+              <w:t>responsibilities</w:t>
             </w:r>
-            <w:proofErr w:type="spellEnd"/>
             <w:r>
               <w:rPr>
                 <w:color w:val="1F4E79"/>
               </w:rPr>
               <w:t>»</w:t>
             </w:r>
-            <w:bookmarkEnd w:id="9"/>
+          </w:p>
+          <w:bookmarkEnd w:id="9"/>
+          <w:p>
+            <w:pPr>
+              <w:rPr>
+                <w:color w:val="1F4E79"/>
+              </w:rPr>
+            </w:pPr>
+          </w:p>
+          <w:p>
+            <w:pPr>
+              <w:rPr>
+                <w:color w:val="1F4E79"/>
+              </w:rPr>
+            </w:pPr>
+          </w:p>
+          <w:p>
+            <w:pPr>
+              <w:rPr>
+                <w:color w:val="1F4E79"/>
+              </w:rPr>
+            </w:pPr>
           </w:p>
           <w:p>
             <w:pPr>
@@ -817,7 +856,7 @@
             <w:tcW w:w="8352" w:type="dxa"/>
           </w:tcPr>
           <w:p>
-            <w:bookmarkStart w:id="13" w:name="education"/>
+            <w:bookmarkStart w:id="13" w:name="educationText"/>
             <w:r>
               <w:rPr>
                 <w:color w:val="1F4E79"/>

</xml_diff>